<commit_message>
fix: atualiza formatacao do modelo de declaracao de embargos
</commit_message>
<xml_diff>
--- a/src/lib/templates/embargos/template.docx
+++ b/src/lib/templates/embargos/template.docx
@@ -33,17 +33,17 @@
           <w:spacing w:val="-2"/>
         </w:rPr>
       </w:pPr>
+      <w:r>
+        <w:rPr>
+          <w:spacing w:val="-2"/>
+        </w:rPr>
+        <w:t>DECLARAÇÃO</w:t>
+      </w:r>
     </w:p>
     <w:p>
       <w:pPr>
         <w:pStyle w:val="Ttulo1"/>
       </w:pPr>
-      <w:r>
-        <w:rPr>
-          <w:spacing w:val="-2"/>
-        </w:rPr>
-        <w:t>DECLARAÇÃO</w:t>
-      </w:r>
     </w:p>
     <w:p>
       <w:pPr>
@@ -231,22 +231,16 @@
     </w:p>
     <w:p>
       <w:pPr>
-        <w:ind w:left="4962"/>
-        <w:rPr>
-          <w:sz w:val="24"/>
-        </w:rPr>
-      </w:pPr>
-      <w:r>
-        <w:rPr>
-          <w:sz w:val="24"/>
-        </w:rPr>
-        <w:t>{municipio_data}</w:t>
-      </w:r>
-      <w:r>
-        <w:rPr>
-          <w:sz w:val="24"/>
-        </w:rPr>
-        <w:t>,</w:t>
+        <w:ind w:left="1985" w:right="-128"/>
+        <w:rPr>
+          <w:sz w:val="24"/>
+        </w:rPr>
+      </w:pPr>
+      <w:r>
+        <w:rPr>
+          <w:sz w:val="24"/>
+        </w:rPr>
+        <w:t>{municipio_data},</w:t>
       </w:r>
       <w:r>
         <w:rPr>
@@ -313,14 +307,7 @@
           <w:spacing w:val="-2"/>
           <w:sz w:val="24"/>
         </w:rPr>
-        <w:t>{ano}</w:t>
-      </w:r>
-      <w:r>
-        <w:rPr>
-          <w:spacing w:val="-2"/>
-          <w:sz w:val="24"/>
-        </w:rPr>
-        <w:t>.</w:t>
+        <w:t>{ano}.</w:t>
       </w:r>
     </w:p>
     <w:p>
@@ -368,88 +355,61 @@
           <w:sz w:val="20"/>
         </w:rPr>
       </w:pPr>
-      <w:r>
+    </w:p>
+    <w:p>
+      <w:pPr>
+        <w:pStyle w:val="Corpodetexto"/>
+        <w:spacing w:before="12"/>
         <w:rPr>
           <w:rFonts w:ascii="Trebuchet MS"/>
           <w:b w:val="0"/>
-          <w:noProof/>
           <w:sz w:val="20"/>
         </w:rPr>
-        <mc:AlternateContent>
-          <mc:Choice Requires="wps">
-            <w:drawing>
-              <wp:anchor distT="0" distB="0" distL="0" distR="0" simplePos="0" relativeHeight="487587840" behindDoc="1" locked="0" layoutInCell="1" allowOverlap="1" wp14:anchorId="69F47067" wp14:editId="61890578">
-                <wp:simplePos x="0" y="0"/>
-                <wp:positionH relativeFrom="page">
-                  <wp:posOffset>1196644</wp:posOffset>
-                </wp:positionH>
-                <wp:positionV relativeFrom="paragraph">
-                  <wp:posOffset>170833</wp:posOffset>
-                </wp:positionV>
-                <wp:extent cx="5170170" cy="1270"/>
-                <wp:effectExtent l="0" t="0" r="0" b="0"/>
-                <wp:wrapTopAndBottom/>
-                <wp:docPr id="4" name="Graphic 4"/>
-                <wp:cNvGraphicFramePr>
-                  <a:graphicFrameLocks xmlns:a="http://schemas.openxmlformats.org/drawingml/2006/main"/>
-                </wp:cNvGraphicFramePr>
-                <a:graphic xmlns:a="http://schemas.openxmlformats.org/drawingml/2006/main">
-                  <a:graphicData uri="http://schemas.microsoft.com/office/word/2010/wordprocessingShape">
-                    <wps:wsp>
-                      <wps:cNvSpPr>
-                        <a:spLocks/>
-                      </wps:cNvSpPr>
-                      <wps:spPr>
-                        <a:xfrm>
-                          <a:off x="0" y="0"/>
-                          <a:ext cx="5170170" cy="1270"/>
-                        </a:xfrm>
-                        <a:custGeom>
-                          <a:avLst/>
-                          <a:gdLst/>
-                          <a:ahLst/>
-                          <a:cxnLst/>
-                          <a:rect l="l" t="t" r="r" b="b"/>
-                          <a:pathLst>
-                            <a:path w="5170170">
-                              <a:moveTo>
-                                <a:pt x="0" y="0"/>
-                              </a:moveTo>
-                              <a:lnTo>
-                                <a:pt x="5169916" y="0"/>
-                              </a:lnTo>
-                            </a:path>
-                          </a:pathLst>
-                        </a:custGeom>
-                        <a:ln w="9601">
-                          <a:solidFill>
-                            <a:srgbClr val="000000"/>
-                          </a:solidFill>
-                          <a:prstDash val="solid"/>
-                        </a:ln>
-                      </wps:spPr>
-                      <wps:bodyPr wrap="square" lIns="0" tIns="0" rIns="0" bIns="0" rtlCol="0">
-                        <a:prstTxWarp prst="textNoShape">
-                          <a:avLst/>
-                        </a:prstTxWarp>
-                        <a:noAutofit/>
-                      </wps:bodyPr>
-                    </wps:wsp>
-                  </a:graphicData>
-                </a:graphic>
-              </wp:anchor>
-            </w:drawing>
-          </mc:Choice>
-          <mc:Fallback>
-            <w:pict>
-              <v:shape w14:anchorId="5377629D" id="Graphic 4" o:spid="_x0000_s1026" style="position:absolute;margin-left:94.2pt;margin-top:13.45pt;width:407.1pt;height:.1pt;z-index:-15728640;visibility:visible;mso-wrap-style:square;mso-wrap-distance-left:0;mso-wrap-distance-top:0;mso-wrap-distance-right:0;mso-wrap-distance-bottom:0;mso-position-horizontal:absolute;mso-position-horizontal-relative:page;mso-position-vertical:absolute;mso-position-vertical-relative:text;v-text-anchor:top" coordsize="5170170,1270" o:gfxdata="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" path="m,l5169916,e" filled="f" strokeweight=".26669mm">
-                <v:path arrowok="t"/>
-                <w10:wrap type="topAndBottom" anchorx="page"/>
-              </v:shape>
-            </w:pict>
-          </mc:Fallback>
-        </mc:AlternateContent>
-      </w:r>
+      </w:pPr>
+    </w:p>
+    <w:p>
+      <w:pPr>
+        <w:pStyle w:val="Corpodetexto"/>
+        <w:spacing w:before="12"/>
+        <w:rPr>
+          <w:rFonts w:ascii="Trebuchet MS"/>
+          <w:b w:val="0"/>
+          <w:sz w:val="20"/>
+        </w:rPr>
+      </w:pPr>
+    </w:p>
+    <w:p>
+      <w:pPr>
+        <w:pStyle w:val="Corpodetexto"/>
+        <w:spacing w:before="12"/>
+        <w:rPr>
+          <w:rFonts w:ascii="Trebuchet MS"/>
+          <w:b w:val="0"/>
+          <w:sz w:val="20"/>
+        </w:rPr>
+      </w:pPr>
+    </w:p>
+    <w:p>
+      <w:pPr>
+        <w:pStyle w:val="Corpodetexto"/>
+        <w:spacing w:before="12"/>
+        <w:rPr>
+          <w:rFonts w:ascii="Trebuchet MS"/>
+          <w:b w:val="0"/>
+          <w:sz w:val="20"/>
+        </w:rPr>
+      </w:pPr>
+    </w:p>
+    <w:p>
+      <w:pPr>
+        <w:pStyle w:val="Corpodetexto"/>
+        <w:spacing w:before="12"/>
+        <w:rPr>
+          <w:rFonts w:ascii="Trebuchet MS"/>
+          <w:b w:val="0"/>
+          <w:sz w:val="20"/>
+        </w:rPr>
+      </w:pPr>
     </w:p>
     <w:p>
       <w:pPr>

</xml_diff>